<commit_message>
Udated document with EDR insted of ERD
</commit_message>
<xml_diff>
--- a/module-2/Bronson_Module2_3_EDR_NoSQL.docx
+++ b/module-2/Bronson_Module2_3_EDR_NoSQL.docx
@@ -28,14 +28,23 @@
         <w:jc w:val="center"/>
       </w:pPr>
       <w:r>
-        <w:t>ERD:</w:t>
+        <w:t>E</w:t>
       </w:r>
-    </w:p>
-    <w:p>
-      <w:pPr>
-        <w:jc w:val="center"/>
-      </w:pPr>
       <w:r>
+        <w:t>DR</w:t>
+      </w:r>
+      <w:r>
+        <w:t>:</w:t>
+      </w:r>
+    </w:p>
+    <w:p>
+      <w:pPr>
+        <w:jc w:val="center"/>
+      </w:pPr>
+      <w:r>
+        <w:rPr>
+          <w:noProof/>
+        </w:rPr>
         <w:drawing>
           <wp:inline distT="0" distB="0" distL="0" distR="0" wp14:anchorId="7F14FD05" wp14:editId="30CF4051">
             <wp:extent cx="3129860" cy="1952818"/>
@@ -86,6 +95,9 @@
         <w:jc w:val="center"/>
       </w:pPr>
       <w:r>
+        <w:rPr>
+          <w:noProof/>
+        </w:rPr>
         <w:drawing>
           <wp:inline distT="0" distB="0" distL="0" distR="0" wp14:anchorId="65BBE85D" wp14:editId="22F21897">
             <wp:extent cx="2795380" cy="3709851"/>

</xml_diff>